<commit_message>
new notes and ready for paper
</commit_message>
<xml_diff>
--- a/docs/CardShark_RL_Project_Report.docx
+++ b/docs/CardShark_RL_Project_Report.docx
@@ -13,7 +13,7 @@
           <w:color w:val="1B365D"/>
           <w:sz w:val="44"/>
         </w:rPr>
-        <w:t>CardShark-RL: Autonomous Reinforcement Learning for Card Games</w:t>
+        <w:t>CardShark-RL: Autonomous Reinforcement Learning for Card Games and Tournament Play</w:t>
       </w:r>
     </w:p>
     <w:p>
@@ -26,7 +26,7 @@
           <w:color w:val="2B6CB0"/>
           <w:sz w:val="25"/>
         </w:rPr>
-        <w:t>System Architecture, Methodology Implementation, and Academic Research Plan</w:t>
+        <w:t>Comprehensive System Architecture, Methodology Implementation, and Academic Research Plan</w:t>
       </w:r>
     </w:p>
     <w:p>
@@ -39,16 +39,7 @@
           <w:color w:val="718096"/>
           <w:sz w:val="19"/>
         </w:rPr>
-        <w:t>Course: CENG 454: Reinforcement Learning (Term Project)</w:t>
-        <w:br/>
-      </w:r>
-      <w:r>
-        <w:rPr>
-          <w:rFonts w:ascii="Calibri" w:hAnsi="Calibri"/>
-          <w:color w:val="718096"/>
-          <w:sz w:val="19"/>
-        </w:rPr>
-        <w:t>Department of Computer Engineering, İzmir Kâtip Çelebi University</w:t>
+        <w:t>Institution: İzmir Kâtip Çelebi University, Department of Computer Engineering</w:t>
         <w:br/>
       </w:r>
       <w:r>
@@ -58,15 +49,6 @@
           <w:sz w:val="19"/>
         </w:rPr>
         <w:t>Project Team: Alkım Gönenç Efe, Sarp Sünbül, Damla Parlakyıldız</w:t>
-        <w:br/>
-      </w:r>
-      <w:r>
-        <w:rPr>
-          <w:rFonts w:ascii="Calibri" w:hAnsi="Calibri"/>
-          <w:color w:val="718096"/>
-          <w:sz w:val="19"/>
-        </w:rPr>
-        <w:t>Date: October 2026</w:t>
       </w:r>
     </w:p>
     <w:p>
@@ -94,7 +76,7 @@
           <w:color w:val="2D3748"/>
           <w:sz w:val="21"/>
         </w:rPr>
-        <w:t>CardShark-RL is an autonomous reinforcement learning framework engineered to solve multi-player, imperfect-information card games. The project was initiated as our term project for CENG 454 (Reinforcement Learning) with the primary goal of investigating whether model-free deep reinforcement learning algorithms can learn sound, adaptive tournament strategies on standard commodity hardware, without relying on heavy real-time tree solvers or massive computing clusters.</w:t>
+        <w:t>CardShark-RL is an autonomous reinforcement learning framework engineered to solve multi-player, imperfect-information card games. The project has the primary goal of investigating whether model-free deep reinforcement learning algorithms can learn sound, adaptive tournament strategies on standard commodity hardware, without relying on heavy real-time tree solvers or massive computing clusters.</w:t>
       </w:r>
     </w:p>
     <w:p>
@@ -120,7 +102,7 @@
           <w:color w:val="2D3748"/>
           <w:sz w:val="21"/>
         </w:rPr>
-        <w:t>This document serves two primary functions: first, as an accessible technical reference bringing all team members and co-authors up to speed on the system's architecture and design decisions; and second, as a structured methodology overview for our faculty advisor and the foundation for our upcoming paper.</w:t>
+        <w:t>This document serves two primary functions: first, as an accessible technical reference bringing all team members and co-authors up to speed on the system's architecture and design decisions; and second, the foundation for our upcoming paper.</w:t>
       </w:r>
     </w:p>
     <w:p>
@@ -406,7 +388,7 @@
           <w:color w:val="2B6CB0"/>
           <w:sz w:val="24"/>
         </w:rPr>
-        <w:t>3.4 Self-Play League Sparring (Prioritized Fictitious Self-Play)</w:t>
+        <w:t>3.4 Self-Play League Sparring &amp; Dynamic Opponent Curriculum</w:t>
       </w:r>
     </w:p>
     <w:p>
@@ -419,7 +401,7 @@
           <w:color w:val="2D3748"/>
           <w:sz w:val="21"/>
         </w:rPr>
-        <w:t>The Problem: Training an agent exclusively against static, rule-based bots causes severe overfitting: the agent learns to exploit the hardcoded programming quirks of those bots, but completely falls apart when exposed to novel styles or aggressive neural counter-strategies.</w:t>
+        <w:t>The Problem: Training an agent exclusively against static, rule-based bots causes severe overfitting: the agent learns to exploit the hardcoded programming quirks of those bots, but completely falls apart when exposed to novel styles or aggressive neural counter-strategies. Conversely, exposing an untrained network immediately to unconstrained self-play often leads to policy destabilization or bizarre exploratory loops before basic card fundamentals are established.</w:t>
       </w:r>
     </w:p>
     <w:p>
@@ -432,7 +414,7 @@
           <w:color w:val="2D3748"/>
           <w:sz w:val="21"/>
         </w:rPr>
-        <w:t>How It Was Implemented: We implemented an autonomous self-play league pool. During training, the framework periodically saves frozen snapshots of the learning policy. When generating training rollout tables, seats are dynamically populated using a prioritized mixture: fixed heuristic bots are retained to maintain basic poker fundamentals, while historical neural checkpoints are sampled from the pool based on competitive difficulty. Past checkpoints that present a high challenge to the current policy are sampled more frequently. Sparring against diverse past iterations of itself prevents the policy from settling into predictable, easily exploitable habits.</w:t>
+        <w:t>How It Was Implemented: We implemented an autonomous self-play league pool governed by a dynamic curriculum schedule. Training begins with an emphasis on diverse heuristic bots (tight-aggressive, loose-aggressive, and passive calling stations) to ground the policy in solid poker discipline—such as folding unplayable holdings pre-flop, respecting aggressive betting, and extracting value from calling stations. As training progresses, the opponent distribution systematically shifts toward self-play league sparring. Checkpoints of the learning policy are saved periodically into the pool. By late-stage training, the vast majority of sparring occurs against past neural iterations and anchor champions sampled via Prioritized Fictitious Self-Play. This curriculum ensures that the agent first masters fundamental game discipline before refining high-level counter-strategies against adaptive neural adversaries.</w:t>
       </w:r>
     </w:p>
     <w:p>
@@ -1395,7 +1377,7 @@
           <w:color w:val="1B365D"/>
           <w:sz w:val="28"/>
         </w:rPr>
-        <w:t>4. Progressive Model Iterations (Texas Hold'em Models A through F)</w:t>
+        <w:t>4. Progressive Model Iterations (Texas Hold'em Models A through G)</w:t>
       </w:r>
     </w:p>
     <w:p>
@@ -1408,7 +1390,7 @@
           <w:color w:val="2D3748"/>
           <w:sz w:val="21"/>
         </w:rPr>
-        <w:t>Rather than treating model development as a single monolithic training run, Texas Hold'em models were evolved across six sequential generations (Model A through Model F). Each iteration was designed to diagnose and resolve specific behavioral and game-theoretic flaws observed in previous versions:</w:t>
+        <w:t>Rather than treating model development as a single monolithic training run, Texas Hold'em models were evolved across seven sequential generations (Model A through Model G). Each iteration was designed to diagnose and resolve specific behavioral and game-theoretic flaws observed in previous versions:</w:t>
       </w:r>
     </w:p>
     <w:p>
@@ -1547,6 +1529,57 @@
           <w:sz w:val="21"/>
         </w:rPr>
         <w:t>Expanded observation inputs to 168 dimensions and the action space to 8 discrete actions (introducing a 33% micro-continuation bet and a 150% overbet). Uncapped blind escalation up to level 7 was introduced to eliminate tournament stalling, and hyperparameter boundaries were systematically screened across learning rates, entropy schedules, and reward shaping coefficients to ensure stable policy convergence.</w:t>
+      </w:r>
+    </w:p>
+    <w:p>
+      <w:pPr>
+        <w:pStyle w:val="ListBullet"/>
+        <w:spacing w:before="20" w:after="60" w:line="276" w:lineRule="auto"/>
+      </w:pPr>
+      <w:r>
+        <w:rPr>
+          <w:rFonts w:ascii="Calibri" w:hAnsi="Calibri"/>
+          <w:b/>
+          <w:color w:val="1B365D"/>
+          <w:sz w:val="21"/>
+        </w:rPr>
+        <w:t xml:space="preserve">Model G (1v1 Heads-Up Specialist): </w:t>
+      </w:r>
+      <w:r>
+        <w:rPr>
+          <w:rFonts w:ascii="Calibri" w:hAnsi="Calibri"/>
+          <w:color w:val="2D3748"/>
+          <w:sz w:val="21"/>
+        </w:rPr>
+        <w:t>A dedicated heads-up specialist trained exclusively in two-player environments under pure linear chip-EV, 100 big blind deep stacks, and aggressive button exploitation. By removing tournament ICM survival penalties and utilizing a dynamic curriculum that transitions from heuristic fundamentals to self-play dominance, Model G learns wide button opening ranges, persistent continuation betting, and aggressive endgame extraction without fear of tournament elimination.</w:t>
+      </w:r>
+    </w:p>
+    <w:p>
+      <w:pPr>
+        <w:keepNext/>
+        <w:spacing w:before="220" w:after="60"/>
+      </w:pPr>
+      <w:r>
+        <w:rPr>
+          <w:rFonts w:ascii="Calibri" w:hAnsi="Calibri"/>
+          <w:b/>
+          <w:color w:val="2B6CB0"/>
+          <w:sz w:val="24"/>
+        </w:rPr>
+        <w:t>4.1 The Composite Model Architecture</w:t>
+      </w:r>
+    </w:p>
+    <w:p>
+      <w:pPr>
+        <w:spacing w:before="0" w:after="100" w:line="276" w:lineRule="auto"/>
+      </w:pPr>
+      <w:r>
+        <w:rPr>
+          <w:rFonts w:ascii="Calibri" w:hAnsi="Calibri"/>
+          <w:color w:val="2D3748"/>
+          <w:sz w:val="21"/>
+        </w:rPr>
+        <w:t>To resolve the fundamental objective mismatch between multi-player tournament survival (where chips lost are worth more than chips won) and heads-up endgame play (where the game reverts to zero-sum linear chip extraction), CardShark-RL introduces a modular Composite Model. Rather than hardcoding specific networks, the Composite Model provides a flexible, plug-and-play architecture with two explicit policy slots: a Tournament Model Slot (operating when 3 or more competitors remain, e.g., Model F) and a Heads-Up Model Slot (automatically engaging when play reaches the final 2 competitors, e.g., Model G).</w:t>
       </w:r>
     </w:p>
     <w:tbl>
@@ -2357,8 +2390,7 @@
             <w:r>
               <w:rPr>
                 <w:rFonts w:ascii="Calibri" w:hAnsi="Calibri"/>
-                <w:b/>
-                <w:color w:val="1B365D"/>
+                <w:color w:val="2D3748"/>
                 <w:sz w:val="17"/>
               </w:rPr>
               <w:t>Model F</w:t>
@@ -2369,6 +2401,134 @@
           <w:tcPr>
             <w:tcW w:type="dxa" w:w="1296"/>
             <w:shd w:fill="F7FAFC"/>
+            <w:tcMar>
+              <w:top w:w="80" w:type="dxa"/>
+              <w:bottom w:w="80" w:type="dxa"/>
+              <w:left w:w="100" w:type="dxa"/>
+              <w:right w:w="100" w:type="dxa"/>
+            </w:tcMar>
+          </w:tcPr>
+          <w:p>
+            <w:pPr>
+              <w:jc w:val="center"/>
+            </w:pPr>
+            <w:r>
+              <w:rPr>
+                <w:rFonts w:ascii="Calibri" w:hAnsi="Calibri"/>
+                <w:color w:val="2D3748"/>
+                <w:sz w:val="17"/>
+              </w:rPr>
+              <w:t>168</w:t>
+            </w:r>
+          </w:p>
+        </w:tc>
+        <w:tc>
+          <w:tcPr>
+            <w:tcW w:type="dxa" w:w="1584"/>
+            <w:shd w:fill="F7FAFC"/>
+            <w:tcMar>
+              <w:top w:w="80" w:type="dxa"/>
+              <w:bottom w:w="80" w:type="dxa"/>
+              <w:left w:w="100" w:type="dxa"/>
+              <w:right w:w="100" w:type="dxa"/>
+            </w:tcMar>
+          </w:tcPr>
+          <w:p>
+            <w:pPr>
+              <w:jc w:val="center"/>
+            </w:pPr>
+            <w:r>
+              <w:rPr>
+                <w:rFonts w:ascii="Calibri" w:hAnsi="Calibri"/>
+                <w:color w:val="2D3748"/>
+                <w:sz w:val="17"/>
+              </w:rPr>
+              <w:t>8 (Decoupled)</w:t>
+            </w:r>
+          </w:p>
+        </w:tc>
+        <w:tc>
+          <w:tcPr>
+            <w:tcW w:type="dxa" w:w="2592"/>
+            <w:shd w:fill="F7FAFC"/>
+            <w:tcMar>
+              <w:top w:w="80" w:type="dxa"/>
+              <w:bottom w:w="80" w:type="dxa"/>
+              <w:left w:w="100" w:type="dxa"/>
+              <w:right w:w="100" w:type="dxa"/>
+            </w:tcMar>
+          </w:tcPr>
+          <w:p>
+            <w:pPr>
+              <w:jc w:val="left"/>
+            </w:pPr>
+            <w:r>
+              <w:rPr>
+                <w:rFonts w:ascii="Calibri" w:hAnsi="Calibri"/>
+                <w:color w:val="2D3748"/>
+                <w:sz w:val="17"/>
+              </w:rPr>
+              <w:t>8-Action Space, Uncapped Blinds, High LR</w:t>
+            </w:r>
+          </w:p>
+        </w:tc>
+        <w:tc>
+          <w:tcPr>
+            <w:tcW w:type="dxa" w:w="2592"/>
+            <w:shd w:fill="F7FAFC"/>
+            <w:tcMar>
+              <w:top w:w="80" w:type="dxa"/>
+              <w:bottom w:w="80" w:type="dxa"/>
+              <w:left w:w="100" w:type="dxa"/>
+              <w:right w:w="100" w:type="dxa"/>
+            </w:tcMar>
+          </w:tcPr>
+          <w:p>
+            <w:pPr>
+              <w:jc w:val="left"/>
+            </w:pPr>
+            <w:r>
+              <w:rPr>
+                <w:rFonts w:ascii="Calibri" w:hAnsi="Calibri"/>
+                <w:color w:val="2D3748"/>
+                <w:sz w:val="17"/>
+              </w:rPr>
+              <w:t>Added 33% micro-bets and 150% overbets; eliminated tournament stalling</w:t>
+            </w:r>
+          </w:p>
+        </w:tc>
+      </w:tr>
+      <w:tr>
+        <w:tc>
+          <w:tcPr>
+            <w:tcW w:type="dxa" w:w="1296"/>
+            <w:shd w:fill="FFFFFF"/>
+            <w:tcMar>
+              <w:top w:w="80" w:type="dxa"/>
+              <w:bottom w:w="80" w:type="dxa"/>
+              <w:left w:w="100" w:type="dxa"/>
+              <w:right w:w="100" w:type="dxa"/>
+            </w:tcMar>
+          </w:tcPr>
+          <w:p>
+            <w:pPr>
+              <w:jc w:val="left"/>
+            </w:pPr>
+            <w:r>
+              <w:rPr>
+                <w:rFonts w:ascii="Calibri" w:hAnsi="Calibri"/>
+                <w:b/>
+                <w:color w:val="1B365D"/>
+                <w:sz w:val="17"/>
+              </w:rPr>
+              <w:t>Model G</w:t>
+            </w:r>
+          </w:p>
+        </w:tc>
+        <w:tc>
+          <w:tcPr>
+            <w:tcW w:type="dxa" w:w="1296"/>
+            <w:shd w:fill="FFFFFF"/>
             <w:tcMar>
               <w:top w:w="80" w:type="dxa"/>
               <w:bottom w:w="80" w:type="dxa"/>
@@ -2394,7 +2554,7 @@
         <w:tc>
           <w:tcPr>
             <w:tcW w:type="dxa" w:w="1584"/>
-            <w:shd w:fill="F7FAFC"/>
+            <w:shd w:fill="FFFFFF"/>
             <w:tcMar>
               <w:top w:w="80" w:type="dxa"/>
               <w:bottom w:w="80" w:type="dxa"/>
@@ -2420,7 +2580,7 @@
         <w:tc>
           <w:tcPr>
             <w:tcW w:type="dxa" w:w="2592"/>
-            <w:shd w:fill="F7FAFC"/>
+            <w:shd w:fill="FFFFFF"/>
             <w:tcMar>
               <w:top w:w="80" w:type="dxa"/>
               <w:bottom w:w="80" w:type="dxa"/>
@@ -2439,14 +2599,14 @@
                 <w:color w:val="1B365D"/>
                 <w:sz w:val="17"/>
               </w:rPr>
-              <w:t>8-Action Space, Uncapped Blinds, High LR</w:t>
+              <w:t>Linear Chip-EV, 100 BB Heads-Up Self-Play</w:t>
             </w:r>
           </w:p>
         </w:tc>
         <w:tc>
           <w:tcPr>
             <w:tcW w:type="dxa" w:w="2592"/>
-            <w:shd w:fill="F7FAFC"/>
+            <w:shd w:fill="FFFFFF"/>
             <w:tcMar>
               <w:top w:w="80" w:type="dxa"/>
               <w:bottom w:w="80" w:type="dxa"/>
@@ -2465,7 +2625,7 @@
                 <w:color w:val="1B365D"/>
                 <w:sz w:val="17"/>
               </w:rPr>
-              <w:t>Added 33% micro-bets and 150% overbets; eliminated tournament stalling</w:t>
+              <w:t>Dedicated 1v1 specialist; eliminates endgame over-folding and maximizes title capture</w:t>
             </w:r>
           </w:p>
         </w:tc>
@@ -2611,7 +2771,7 @@
           <w:color w:val="2D3748"/>
           <w:sz w:val="21"/>
         </w:rPr>
-        <w:t>For our term paper, we plan to center the core narrative on Texas Hold'em, using 5-Card Draw and 2-7 Triple Draw as cross-game generalization case studies. To ensure that our study makes a substantive scientific contribution beyond simply reporting that a neural network learned to play cards, we have designed five targeted ablation experiments that isolate and quantify the specific contribution of each architectural component:</w:t>
+        <w:t>For our paper, we plan to center the core narrative on Texas Hold'em, using 5-Card Draw and 2-7 Triple Draw as cross-game generalization case studies. To ensure that our study makes a substantive scientific contribution beyond simply reporting that a neural network learned to play cards, we have designed six targeted ablation experiments that isolate and quantify the specific contribution of each architectural component:</w:t>
       </w:r>
     </w:p>
     <w:p>
@@ -2817,6 +2977,47 @@
           <w:sz w:val="21"/>
         </w:rPr>
         <w:t>Methodology: We will train one agent exclusively against static heuristic bots and a second agent inside our self-play league pool. Both models will then be evaluated against novel, previously unencountered opponent archetypes (such as erratic random callers, extreme hyper-maniacs, and unbluffable stations). We will measure behavioral exploitability to verify that self-play sparring confers genuine strategic robustness.</w:t>
+      </w:r>
+    </w:p>
+    <w:p>
+      <w:pPr>
+        <w:keepNext/>
+        <w:spacing w:before="220" w:after="60"/>
+      </w:pPr>
+      <w:r>
+        <w:rPr>
+          <w:rFonts w:ascii="Calibri" w:hAnsi="Calibri"/>
+          <w:b/>
+          <w:color w:val="2B6CB0"/>
+          <w:sz w:val="24"/>
+        </w:rPr>
+        <w:t>6.6 Ablation 6: Composite Regime-Switching vs. Monolithic Policies</w:t>
+      </w:r>
+    </w:p>
+    <w:p>
+      <w:pPr>
+        <w:spacing w:before="0" w:after="100" w:line="276" w:lineRule="auto"/>
+      </w:pPr>
+      <w:r>
+        <w:rPr>
+          <w:rFonts w:ascii="Calibri" w:hAnsi="Calibri"/>
+          <w:color w:val="2D3748"/>
+          <w:sz w:val="21"/>
+        </w:rPr>
+        <w:t>Hypothesis: Monolithic policies trained exclusively under multi-player tournament incentives suffer from an objective mismatch: they learn risk-averse chip preservation that causes them to play overly passively once the field narrows to heads-up play. Conversely, a modular Composite Model pairing a tournament specialist (Model F) with a dedicated heads-up specialist (Model G) will significantly elevate heads-up conversion and overall championship titles.</w:t>
+      </w:r>
+    </w:p>
+    <w:p>
+      <w:pPr>
+        <w:spacing w:before="0" w:after="100" w:line="276" w:lineRule="auto"/>
+      </w:pPr>
+      <w:r>
+        <w:rPr>
+          <w:rFonts w:ascii="Calibri" w:hAnsi="Calibri"/>
+          <w:color w:val="2D3748"/>
+          <w:sz w:val="21"/>
+        </w:rPr>
+        <w:t>Methodology: We will evaluate the Tournament Specialist alone (Model F), the Heads-Up Specialist alone (Model G), and the Composite Model (Model F + Model G) across both dedicated 1v1 duels and 5-player Sit-and-Go tournament benchmarks. By measuring button open frequencies, showdown avoidance, and heads-up conversion rates, we will quantify how modular regime-switching overcomes the limitations of monolithic deep RL.</w:t>
       </w:r>
     </w:p>
     <w:sectPr>

</xml_diff>